<commit_message>
Remove the property-bound header control that printed "[Subject]"
The branded template's page header contained a content control bound to the
document's Subject property. Clearing the source document's metadata (so no
trace of the organisation the template was derived from reaches a customer
report) left that property empty, and Word renders an empty bound control as
its grey placeholder — so every generated report carried a literal "[Subject]"
in the running header.

- assets/tia_template.docx: the bound control is replaced by static text. Page
  numbering in the footer is a field and is deliberately kept.
- tests/test_docx_writer.py: assert no <w:sdt> and no dataBinding survives in
  any header or footer of a generated document, and that PAGE still does.

The existing no-source-remnants test is unaffected: the metadata stays cleared,
which is what exposed this.

Co-Authored-By: Claude Opus 5 <noreply@anthropic.com>
</commit_message>
<xml_diff>
--- a/assets/tia_template.docx
+++ b/assets/tia_template.docx
@@ -283,31 +283,13 @@
       </w:rPr>
       <w:tab/>
     </w:r>
-    <w:sdt>
-      <w:sdtPr>
-        <w:rPr>
-          <w:b/>
-          <w:bCs/>
-        </w:rPr>
-        <w:alias w:val="Status"/>
-        <w:tag w:val=""/>
-        <w:id w:val="-287975633"/>
-        <w:placeholder>
-          <w:docPart w:val="D9069D61C5BB42AD92F0522457BC5978"/>
-        </w:placeholder>
-        <w:dataBinding w:prefixMappings="xmlns:ns0='http://purl.org/dc/elements/1.1/' xmlns:ns1='http://schemas.openxmlformats.org/package/2006/metadata/core-properties' " w:xpath="/ns1:coreProperties[1]/ns1:contentStatus[1]" w:storeItemID="{6C3C8BC8-F283-45AE-878A-BAB7291924A1}"/>
-        <w:text/>
-      </w:sdtPr>
-      <w:sdtContent>
-        <w:r>
-          <w:rPr>
-            <w:b/>
-            <w:bCs/>
-          </w:rPr>
-          <w:t>Commercial in Confidence</w:t>
-        </w:r>
-      </w:sdtContent>
-    </w:sdt>
+    <w:r>
+      <w:rPr>
+        <w:b/>
+        <w:bCs/>
+      </w:rPr>
+      <w:t>Commercial in Confidence</w:t>
+    </w:r>
     <w:r>
       <w:rPr>
         <w:b/>
@@ -414,31 +396,13 @@
       </w:rPr>
       <w:tab/>
     </w:r>
-    <w:sdt>
-      <w:sdtPr>
-        <w:rPr>
-          <w:b/>
-          <w:bCs/>
-        </w:rPr>
-        <w:alias w:val="Status"/>
-        <w:tag w:val=""/>
-        <w:id w:val="1600214961"/>
-        <w:placeholder>
-          <w:docPart w:val="515E5F0DD9BA4967B4EDCAC193882571"/>
-        </w:placeholder>
-        <w:dataBinding w:prefixMappings="xmlns:ns0='http://purl.org/dc/elements/1.1/' xmlns:ns1='http://schemas.openxmlformats.org/package/2006/metadata/core-properties' " w:xpath="/ns1:coreProperties[1]/ns1:contentStatus[1]" w:storeItemID="{6C3C8BC8-F283-45AE-878A-BAB7291924A1}"/>
-        <w:text/>
-      </w:sdtPr>
-      <w:sdtContent>
-        <w:r>
-          <w:rPr>
-            <w:b/>
-            <w:bCs/>
-          </w:rPr>
-          <w:t>Commercial in Confidence</w:t>
-        </w:r>
-      </w:sdtContent>
-    </w:sdt>
+    <w:r>
+      <w:rPr>
+        <w:b/>
+        <w:bCs/>
+      </w:rPr>
+      <w:t>Commercial in Confidence</w:t>
+    </w:r>
     <w:r>
       <w:rPr>
         <w:b/>
@@ -571,43 +535,15 @@
                           <w:pPr>
                             <w:pStyle w:val="Header1"/>
                           </w:pPr>
-                          <w:sdt>
-                            <w:sdtPr>
-                              <w:alias w:val="Title"/>
-                              <w:tag w:val=""/>
-                              <w:id w:val="-1261373180"/>
-                              <w:placeholder>
-                                <w:docPart w:val="6122125BB9844C50ABD1CF8C3E1E14B1"/>
-                              </w:placeholder>
-                              <w:dataBinding w:prefixMappings="xmlns:ns0='http://purl.org/dc/elements/1.1/' xmlns:ns1='http://schemas.openxmlformats.org/package/2006/metadata/core-properties' " w:xpath="/ns1:coreProperties[1]/ns0:title[1]" w:storeItemID="{6C3C8BC8-F283-45AE-878A-BAB7291924A1}"/>
-                              <w:text/>
-                            </w:sdtPr>
-                            <w:sdtContent>
-                              <w:r>
-                                <w:t/>
-                              </w:r>
-                            </w:sdtContent>
-                          </w:sdt>
+                          <w:r>
+                            <w:t/>
+                          </w:r>
                           <w:r>
                             <w:t xml:space="preserve"> </w:t>
                           </w:r>
-                          <w:sdt>
-                            <w:sdtPr>
-                              <w:alias w:val="Subject"/>
-                              <w:tag w:val=""/>
-                              <w:id w:val="-1272239723"/>
-                              <w:placeholder>
-                                <w:docPart w:val="A2E564DA5E4743E78D08811310D67066"/>
-                              </w:placeholder>
-                              <w:dataBinding w:prefixMappings="xmlns:ns0='http://purl.org/dc/elements/1.1/' xmlns:ns1='http://schemas.openxmlformats.org/package/2006/metadata/core-properties' " w:xpath="/ns1:coreProperties[1]/ns0:subject[1]" w:storeItemID="{6C3C8BC8-F283-45AE-878A-BAB7291924A1}"/>
-                              <w:text/>
-                            </w:sdtPr>
-                            <w:sdtContent>
-                              <w:r>
-                                <w:t>Online Technical Infrastructure Assessment Report</w:t>
-                              </w:r>
-                            </w:sdtContent>
-                          </w:sdt>
+                          <w:r>
+                            <w:t>Online Technical Infrastructure Assessment Report</w:t>
+                          </w:r>
                         </w:p>
                         <w:p>
                           <w:pPr>
@@ -650,43 +586,15 @@
                     <w:pPr>
                       <w:pStyle w:val="Header1"/>
                     </w:pPr>
-                    <w:sdt>
-                      <w:sdtPr>
-                        <w:alias w:val="Title"/>
-                        <w:tag w:val=""/>
-                        <w:id w:val="-1261373180"/>
-                        <w:placeholder>
-                          <w:docPart w:val="6122125BB9844C50ABD1CF8C3E1E14B1"/>
-                        </w:placeholder>
-                        <w:dataBinding w:prefixMappings="xmlns:ns0='http://purl.org/dc/elements/1.1/' xmlns:ns1='http://schemas.openxmlformats.org/package/2006/metadata/core-properties' " w:xpath="/ns1:coreProperties[1]/ns0:title[1]" w:storeItemID="{6C3C8BC8-F283-45AE-878A-BAB7291924A1}"/>
-                        <w:text/>
-                      </w:sdtPr>
-                      <w:sdtContent>
-                        <w:r>
-                          <w:t/>
-                        </w:r>
-                      </w:sdtContent>
-                    </w:sdt>
+                    <w:r>
+                      <w:t/>
+                    </w:r>
                     <w:r>
                       <w:t xml:space="preserve"> </w:t>
                     </w:r>
-                    <w:sdt>
-                      <w:sdtPr>
-                        <w:alias w:val="Subject"/>
-                        <w:tag w:val=""/>
-                        <w:id w:val="-1272239723"/>
-                        <w:placeholder>
-                          <w:docPart w:val="A2E564DA5E4743E78D08811310D67066"/>
-                        </w:placeholder>
-                        <w:dataBinding w:prefixMappings="xmlns:ns0='http://purl.org/dc/elements/1.1/' xmlns:ns1='http://schemas.openxmlformats.org/package/2006/metadata/core-properties' " w:xpath="/ns1:coreProperties[1]/ns0:subject[1]" w:storeItemID="{6C3C8BC8-F283-45AE-878A-BAB7291924A1}"/>
-                        <w:text/>
-                      </w:sdtPr>
-                      <w:sdtContent>
-                        <w:r>
-                          <w:t>Online Technical Infrastructure Assessment Report</w:t>
-                        </w:r>
-                      </w:sdtContent>
-                    </w:sdt>
+                    <w:r>
+                      <w:t>Online Technical Infrastructure Assessment Report</w:t>
+                    </w:r>
                   </w:p>
                   <w:p>
                     <w:pPr>

</xml_diff>